<commit_message>
P2: finalize form 02 rendering and pin full normative sources
</commit_message>
<xml_diff>
--- a/products-storage/02-dopraboty-bez-poter/02-soglasovanie-obema.docx
+++ b/products-storage/02-dopraboty-bez-poter/02-soglasovanie-obema.docx
@@ -5,9 +5,16 @@
     <w:p>
       <w:pPr>
         <w:pStyle w:val="Title"/>
+        <w:spacing w:after="180"/>
         <w:jc w:val="left"/>
       </w:pPr>
       <w:r>
+        <w:rPr>
+          <w:rFonts w:ascii="Times New Roman" w:hAnsi="Times New Roman"/>
+          <w:b/>
+          <w:color w:val="000000"/>
+          <w:sz w:val="34"/>
+        </w:rPr>
         <w:t>Согласование объёма дополнительных работ</w:t>
       </w:r>
     </w:p>
@@ -2317,16 +2324,13 @@
     <w:qFormat/>
     <w:rsid w:val="00FC693F"/>
     <w:pPr>
-      <w:pBdr>
-        <w:bottom w:val="single" w:sz="8" w:space="4" w:color="4F81BD" w:themeColor="accent1"/>
-      </w:pBdr>
-      <w:spacing w:after="100" w:line="240" w:lineRule="auto" w:before="0"/>
+      <w:spacing w:after="180" w:line="240" w:lineRule="auto"/>
       <w:contextualSpacing/>
     </w:pPr>
     <w:rPr>
       <w:rFonts w:asciiTheme="majorHAnsi" w:eastAsiaTheme="majorEastAsia" w:hAnsiTheme="majorHAnsi" w:cstheme="majorBidi" w:ascii="Times New Roman" w:hAnsi="Times New Roman"/>
       <w:b/>
-      <w:color w:val="262F37"/>
+      <w:color w:val="000000"/>
       <w:spacing w:val="5"/>
       <w:kern w:val="28"/>
       <w:sz w:val="34"/>

</xml_diff>